<commit_message>
chore: sync all PM folders and latest updates
</commit_message>
<xml_diff>
--- a/PM03/PM-03 Projects with JavaScript.docx
+++ b/PM03/PM-03 Projects with JavaScript.docx
@@ -4592,30 +4592,30 @@
           <w:szCs w:val="36"/>
           <w:highlight w:val="green"/>
         </w:rPr>
-        <w:t>Activity 4.1: Project Planning and Design</w:t>
-      </w:r>
-    </w:p>
-    <w:p>
-      <w:pPr>
-        <w:rPr>
-          <w:b/>
-          <w:bCs/>
-        </w:rPr>
-      </w:pPr>
-    </w:p>
-    <w:p>
-      <w:pPr>
-        <w:rPr>
-          <w:b/>
-          <w:bCs/>
-        </w:rPr>
-      </w:pPr>
-      <w:r>
-        <w:rPr>
-          <w:b/>
-          <w:bCs/>
-        </w:rPr>
-        <w:t>1. Problem Statement &amp; Target User Description</w:t>
+        <w:t>Project Planning and Design</w:t>
+      </w:r>
+    </w:p>
+    <w:p>
+      <w:pPr>
+        <w:rPr>
+          <w:b/>
+          <w:bCs/>
+        </w:rPr>
+      </w:pPr>
+    </w:p>
+    <w:p>
+      <w:pPr>
+        <w:rPr>
+          <w:b/>
+          <w:bCs/>
+        </w:rPr>
+      </w:pPr>
+      <w:r>
+        <w:rPr>
+          <w:b/>
+          <w:bCs/>
+        </w:rPr>
+        <w:t xml:space="preserve"> Problem Statement &amp; Target User Description</w:t>
       </w:r>
     </w:p>
     <w:p>
@@ -4676,7 +4676,7 @@
           <w:b/>
           <w:bCs/>
         </w:rPr>
-        <w:t>2. Functional Requirements</w:t>
+        <w:t>Functional Requirements</w:t>
       </w:r>
     </w:p>
     <w:p>
@@ -4756,7 +4756,7 @@
           <w:b/>
           <w:bCs/>
         </w:rPr>
-        <w:t>3. Page Sketch / Wireframe</w:t>
+        <w:t xml:space="preserve"> Page Sketch / Wireframe</w:t>
       </w:r>
     </w:p>
     <w:p>
@@ -4819,7 +4819,7 @@
           <w:b/>
           <w:bCs/>
         </w:rPr>
-        <w:t>4. Planned Data Structure &amp; Logic</w:t>
+        <w:t xml:space="preserve"> Planned Data Structure &amp; Logic</w:t>
       </w:r>
     </w:p>
     <w:p>
@@ -4969,7 +4969,7 @@
           <w:lang w:eastAsia="en-ZA"/>
           <w14:ligatures w14:val="none"/>
         </w:rPr>
-        <w:t>5. Test Plan</w:t>
+        <w:t>Test Plan</w:t>
       </w:r>
     </w:p>
     <w:tbl>
@@ -5895,7 +5895,7 @@
           <w:b/>
           <w:bCs/>
         </w:rPr>
-        <w:t>6. Github R</w:t>
+        <w:t xml:space="preserve"> Github R</w:t>
       </w:r>
       <w:r>
         <w:rPr>
@@ -6053,7 +6053,7 @@
           <w:szCs w:val="36"/>
           <w:highlight w:val="green"/>
         </w:rPr>
-        <w:t>Activity 4.2: Project Build and Version Control</w:t>
+        <w:t>Project Build and Version Control</w:t>
       </w:r>
     </w:p>
     <w:p>
@@ -7116,7 +7116,7 @@
           <w:szCs w:val="36"/>
           <w:highlight w:val="green"/>
         </w:rPr>
-        <w:t>Activity 4.3: Project Testing, Debugging and Improvement</w:t>
+        <w:t>Project Testing, Debugging and Improvement</w:t>
       </w:r>
     </w:p>
     <w:p>
@@ -9870,29 +9870,6 @@
           <w14:ligatures w14:val="none"/>
         </w:rPr>
       </w:pPr>
-    </w:p>
-    <w:p>
-      <w:pPr>
-        <w:spacing w:after="0" w:line="240" w:lineRule="auto"/>
-        <w:rPr>
-          <w:b/>
-          <w:bCs/>
-          <w:color w:val="101010"/>
-          <w:sz w:val="36"/>
-          <w:szCs w:val="36"/>
-        </w:rPr>
-      </w:pPr>
-      <w:r>
-        <w:rPr>
-          <w:b/>
-          <w:bCs/>
-          <w:color w:val="101010"/>
-          <w:sz w:val="36"/>
-          <w:szCs w:val="36"/>
-          <w:highlight w:val="green"/>
-        </w:rPr>
-        <w:t>Activity 4.4: Final Demonstration, Presentation and Reflection</w:t>
-      </w:r>
     </w:p>
     <w:p>
       <w:pPr>

</xml_diff>